<commit_message>
reports2/ HTML로 전환, DOCX 섹션 11 업데이트 (통계 1,350개 기준)
- reports2/ JSON → HTML 로 교체: 19개 카테고리별 대표 케이스 HTML
  (정상종료, NegVol, NaN, Hourglass, KE폭발, Segfault, MPP불균형 CRITICAL/WARNING,
   에너지발산, 접촉에너지, Warning_40533/40538, Implicit 60303 등)
- post_batch.py: build_reports2() 인덱스 기반 소스 디렉터리 탐색 + HTML 생성으로 변경
- FEATURE_STATUS_REPORT.docx: 섹션 11 추가 (분석 904개, CRIT 2,831, WARN 4,914)
- make_docx.py: 베이스 DOCX 생성 스크립트 추가

Co-Authored-By: Claude Sonnet 4.6 <noreply@anthropic.com>
</commit_message>
<xml_diff>
--- a/FEATURE_STATUS_REPORT.docx
+++ b/FEATURE_STATUS_REPORT.docx
@@ -7231,7 +7231,7 @@
               <w:rPr>
                 <w:sz w:val="18"/>
               </w:rPr>
-              <w:t>890개</w:t>
+              <w:t>904개</w:t>
             </w:r>
           </w:p>
         </w:tc>
@@ -7259,7 +7259,7 @@
               <w:rPr>
                 <w:sz w:val="18"/>
               </w:rPr>
-              <w:t>849개</w:t>
+              <w:t>857개</w:t>
             </w:r>
           </w:p>
         </w:tc>
@@ -7289,7 +7289,7 @@
               <w:rPr>
                 <w:sz w:val="18"/>
               </w:rPr>
-              <w:t>11개</w:t>
+              <w:t>13개</w:t>
             </w:r>
           </w:p>
         </w:tc>
@@ -7317,7 +7317,7 @@
               <w:rPr>
                 <w:sz w:val="18"/>
               </w:rPr>
-              <w:t>30개</w:t>
+              <w:t>34개</w:t>
             </w:r>
           </w:p>
         </w:tc>
@@ -7375,7 +7375,7 @@
               <w:rPr>
                 <w:sz w:val="18"/>
               </w:rPr>
-              <w:t>2,810건</w:t>
+              <w:t>2,831건</w:t>
             </w:r>
           </w:p>
         </w:tc>
@@ -7405,7 +7405,7 @@
               <w:rPr>
                 <w:sz w:val="18"/>
               </w:rPr>
-              <w:t>4,894건</w:t>
+              <w:t>4,914건</w:t>
             </w:r>
           </w:p>
         </w:tc>
@@ -7490,7 +7490,7 @@
               <w:rPr>
                 <w:sz w:val="18"/>
               </w:rPr>
-              <w:t>832</w:t>
+              <w:t>834</w:t>
             </w:r>
           </w:p>
         </w:tc>
@@ -7518,7 +7518,7 @@
               <w:rPr>
                 <w:sz w:val="18"/>
               </w:rPr>
-              <w:t>831</w:t>
+              <w:t>832</w:t>
             </w:r>
           </w:p>
         </w:tc>
@@ -7766,7 +7766,7 @@
               <w:rPr>
                 <w:sz w:val="18"/>
               </w:rPr>
-              <w:t>Negative sliding interface energy (-7.208E-06)</w:t>
+              <w:t>Total energy is increasing (divergence)</w:t>
             </w:r>
           </w:p>
         </w:tc>
@@ -7795,7 +7795,7 @@
               <w:rPr>
                 <w:sz w:val="18"/>
               </w:rPr>
-              <w:t>Total energy is increasing (divergence)</w:t>
+              <w:t>Negative sliding interface energy (-7.208E-06)</w:t>
             </w:r>
           </w:p>
         </w:tc>
@@ -7808,7 +7808,7 @@
               <w:rPr>
                 <w:sz w:val="18"/>
               </w:rPr>
-              <w:t>36</w:t>
+              <w:t>37</w:t>
             </w:r>
           </w:p>
         </w:tc>
@@ -7824,7 +7824,7 @@
               <w:rPr>
                 <w:sz w:val="18"/>
               </w:rPr>
-              <w:t>Negative sliding interface energy (-7.207E-06)</w:t>
+              <w:t>해석 미완료 (출력 불완전)</w:t>
             </w:r>
           </w:p>
         </w:tc>
@@ -7838,7 +7838,7 @@
               <w:rPr>
                 <w:sz w:val="18"/>
               </w:rPr>
-              <w:t>33</w:t>
+              <w:t>34</w:t>
             </w:r>
           </w:p>
         </w:tc>
@@ -7853,7 +7853,7 @@
               <w:rPr>
                 <w:sz w:val="18"/>
               </w:rPr>
-              <w:t>Negative sliding interface energy (-7.217E-06)</w:t>
+              <w:t>Negative sliding interface energy (-7.207E-06)</w:t>
             </w:r>
           </w:p>
         </w:tc>
@@ -7866,7 +7866,7 @@
               <w:rPr>
                 <w:sz w:val="18"/>
               </w:rPr>
-              <w:t>31</w:t>
+              <w:t>33</w:t>
             </w:r>
           </w:p>
         </w:tc>
@@ -7882,7 +7882,7 @@
               <w:rPr>
                 <w:sz w:val="18"/>
               </w:rPr>
-              <w:t>해석 미완료 (출력 불완전)</w:t>
+              <w:t>Negative sliding interface energy (-7.217E-06)</w:t>
             </w:r>
           </w:p>
         </w:tc>
@@ -7896,7 +7896,7 @@
               <w:rPr>
                 <w:sz w:val="18"/>
               </w:rPr>
-              <w:t>30</w:t>
+              <w:t>31</w:t>
             </w:r>
           </w:p>
         </w:tc>
@@ -8025,7 +8025,7 @@
               <w:rPr>
                 <w:sz w:val="18"/>
               </w:rPr>
-              <w:t>Warning/Error 60121</w:t>
+              <w:t>Warning/Error 40533</w:t>
             </w:r>
           </w:p>
         </w:tc>
@@ -8039,7 +8039,7 @@
               <w:rPr>
                 <w:sz w:val="18"/>
               </w:rPr>
-              <w:t>661</w:t>
+              <w:t>18,712</w:t>
             </w:r>
           </w:p>
         </w:tc>
@@ -8067,7 +8067,7 @@
               <w:rPr>
                 <w:sz w:val="18"/>
               </w:rPr>
-              <w:t>222</w:t>
+              <w:t>14,806</w:t>
             </w:r>
           </w:p>
         </w:tc>
@@ -8083,7 +8083,7 @@
               <w:rPr>
                 <w:sz w:val="18"/>
               </w:rPr>
-              <w:t>Warning/Error 40509</w:t>
+              <w:t>Warning/Error 40532</w:t>
             </w:r>
           </w:p>
         </w:tc>
@@ -8097,7 +8097,7 @@
               <w:rPr>
                 <w:sz w:val="18"/>
               </w:rPr>
-              <w:t>12</w:t>
+              <w:t>5,245</w:t>
             </w:r>
           </w:p>
         </w:tc>
@@ -8112,7 +8112,7 @@
               <w:rPr>
                 <w:sz w:val="18"/>
               </w:rPr>
-              <w:t>Warning/Error 40024</w:t>
+              <w:t>Warning/Error 30062</w:t>
             </w:r>
           </w:p>
         </w:tc>
@@ -8125,7 +8125,7 @@
               <w:rPr>
                 <w:sz w:val="18"/>
               </w:rPr>
-              <w:t>6</w:t>
+              <w:t>3,854</w:t>
             </w:r>
           </w:p>
         </w:tc>
@@ -8141,7 +8141,7 @@
               <w:rPr>
                 <w:sz w:val="18"/>
               </w:rPr>
-              <w:t>Warning/Error 40500</w:t>
+              <w:t>Warning/Error 40540</w:t>
             </w:r>
           </w:p>
         </w:tc>
@@ -8155,7 +8155,7 @@
               <w:rPr>
                 <w:sz w:val="18"/>
               </w:rPr>
-              <w:t>5</w:t>
+              <w:t>1,158</w:t>
             </w:r>
           </w:p>
         </w:tc>
@@ -8170,7 +8170,7 @@
               <w:rPr>
                 <w:sz w:val="18"/>
               </w:rPr>
-              <w:t>Warning/Error 20018</w:t>
+              <w:t>Warning/Error 60121</w:t>
             </w:r>
           </w:p>
         </w:tc>
@@ -8183,7 +8183,7 @@
               <w:rPr>
                 <w:sz w:val="18"/>
               </w:rPr>
-              <w:t>4</w:t>
+              <w:t>661</w:t>
             </w:r>
           </w:p>
         </w:tc>
@@ -8199,7 +8199,7 @@
               <w:rPr>
                 <w:sz w:val="18"/>
               </w:rPr>
-              <w:t>Warning/Error 20216</w:t>
+              <w:t>Warning/Error 30060</w:t>
             </w:r>
           </w:p>
         </w:tc>
@@ -8213,7 +8213,7 @@
               <w:rPr>
                 <w:sz w:val="18"/>
               </w:rPr>
-              <w:t>4</w:t>
+              <w:t>72</w:t>
             </w:r>
           </w:p>
         </w:tc>
@@ -8228,7 +8228,7 @@
               <w:rPr>
                 <w:sz w:val="18"/>
               </w:rPr>
-              <w:t>Warning/Error 41434</w:t>
+              <w:t>Warning/Error 40534</w:t>
             </w:r>
           </w:p>
         </w:tc>
@@ -8241,7 +8241,7 @@
               <w:rPr>
                 <w:sz w:val="18"/>
               </w:rPr>
-              <w:t>2</w:t>
+              <w:t>68</w:t>
             </w:r>
           </w:p>
         </w:tc>
@@ -8257,7 +8257,7 @@
               <w:rPr>
                 <w:sz w:val="18"/>
               </w:rPr>
-              <w:t>Warning/Error 40455</w:t>
+              <w:t>Warning/Error 40509</w:t>
             </w:r>
           </w:p>
         </w:tc>
@@ -8271,7 +8271,7 @@
               <w:rPr>
                 <w:sz w:val="18"/>
               </w:rPr>
-              <w:t>2</w:t>
+              <w:t>18</w:t>
             </w:r>
           </w:p>
         </w:tc>
@@ -8286,7 +8286,7 @@
               <w:rPr>
                 <w:sz w:val="18"/>
               </w:rPr>
-              <w:t>Warning/Error 40456</w:t>
+              <w:t>Warning/Error 20546</w:t>
             </w:r>
           </w:p>
         </w:tc>
@@ -8299,7 +8299,7 @@
               <w:rPr>
                 <w:sz w:val="18"/>
               </w:rPr>
-              <w:t>2</w:t>
+              <w:t>8</w:t>
             </w:r>
           </w:p>
         </w:tc>
@@ -8315,7 +8315,7 @@
               <w:rPr>
                 <w:sz w:val="18"/>
               </w:rPr>
-              <w:t>Warning/Error 60303</w:t>
+              <w:t>Warning/Error 40024</w:t>
             </w:r>
           </w:p>
         </w:tc>
@@ -8329,7 +8329,7 @@
               <w:rPr>
                 <w:sz w:val="18"/>
               </w:rPr>
-              <w:t>1</w:t>
+              <w:t>6</w:t>
             </w:r>
           </w:p>
         </w:tc>
@@ -8344,7 +8344,7 @@
               <w:rPr>
                 <w:sz w:val="18"/>
               </w:rPr>
-              <w:t>Warning/Error 30358</w:t>
+              <w:t>Warning/Error 30128</w:t>
             </w:r>
           </w:p>
         </w:tc>
@@ -8357,7 +8357,37 @@
               <w:rPr>
                 <w:sz w:val="18"/>
               </w:rPr>
-              <w:t>1</w:t>
+              <w:t>5</w:t>
+            </w:r>
+          </w:p>
+        </w:tc>
+      </w:tr>
+      <w:tr>
+        <w:tc>
+          <w:tcPr>
+            <w:tcW w:type="dxa" w:w="3600"/>
+            <w:shd w:val="clear" w:color="auto" w:fill="EEF2F9"/>
+          </w:tcPr>
+          <w:p>
+            <w:r>
+              <w:rPr>
+                <w:sz w:val="18"/>
+              </w:rPr>
+              <w:t>Warning/Error 30131</w:t>
+            </w:r>
+          </w:p>
+        </w:tc>
+        <w:tc>
+          <w:tcPr>
+            <w:tcW w:type="dxa" w:w="5040"/>
+            <w:shd w:val="clear" w:color="auto" w:fill="EEF2F9"/>
+          </w:tcPr>
+          <w:p>
+            <w:r>
+              <w:rPr>
+                <w:sz w:val="18"/>
+              </w:rPr>
+              <w:t>5</w:t>
             </w:r>
           </w:p>
         </w:tc>
@@ -8369,7 +8399,7 @@
         <w:pStyle w:val="Heading2"/>
       </w:pPr>
       <w:r>
-        <w:t>11.4 다양성 검증 케이스 (reports2/ — 37개)</w:t>
+        <w:t>11.4 다양성 검증 케이스 (reports2/ — 19개)</w:t>
       </w:r>
     </w:p>
     <w:p>
@@ -8519,7 +8549,7 @@
               <w:rPr>
                 <w:sz w:val="18"/>
               </w:rPr>
-              <w:t>alt_ale/ex01_ale_f500</w:t>
+              <w:t>1.DisplayImpactBallPeridynamics/Impact_1_00000001</w:t>
             </w:r>
           </w:p>
         </w:tc>
@@ -8533,7 +8563,7 @@
               <w:rPr>
                 <w:sz w:val="18"/>
               </w:rPr>
-              <w:t>INCOMPLETE</w:t>
+              <w:t>ERROR</w:t>
             </w:r>
           </w:p>
         </w:tc>
@@ -8547,7 +8577,7 @@
               <w:rPr>
                 <w:sz w:val="18"/>
               </w:rPr>
-              <w:t>8</w:t>
+              <w:t>9</w:t>
             </w:r>
           </w:p>
         </w:tc>
@@ -8561,7 +8591,7 @@
               <w:rPr>
                 <w:sz w:val="18"/>
               </w:rPr>
-              <w:t>2</w:t>
+              <w:t>4</w:t>
             </w:r>
           </w:p>
         </w:tc>
@@ -8575,7 +8605,7 @@
               <w:rPr>
                 <w:sz w:val="18"/>
               </w:rPr>
-              <w:t>해석 미완료 (출력 불완전)</w:t>
+              <w:t>해석 에러 종료</w:t>
             </w:r>
           </w:p>
         </w:tc>
@@ -8603,7 +8633,7 @@
               <w:rPr>
                 <w:sz w:val="18"/>
               </w:rPr>
-              <w:t>alt_ale/ex02_ale_f1000</w:t>
+              <w:t>alt_ale/ex01_ale_f500</w:t>
             </w:r>
           </w:p>
         </w:tc>
@@ -9681,7 +9711,7 @@
               <w:rPr>
                 <w:sz w:val="18"/>
               </w:rPr>
-              <w:t>results/ball_drop_v2_dp_ex09_mat077_optimal_dp</w:t>
+              <w:t>1.DisplayImpactBallPeridynamics/Impact_1_00000001</w:t>
             </w:r>
           </w:p>
         </w:tc>
@@ -9709,7 +9739,7 @@
               <w:rPr>
                 <w:sz w:val="18"/>
               </w:rPr>
-              <w:t>4</w:t>
+              <w:t>9</w:t>
             </w:r>
           </w:p>
         </w:tc>
@@ -9723,7 +9753,7 @@
               <w:rPr>
                 <w:sz w:val="18"/>
               </w:rPr>
-              <w:t>3</w:t>
+              <w:t>4</w:t>
             </w:r>
           </w:p>
         </w:tc>
@@ -9765,7 +9795,7 @@
               <w:rPr>
                 <w:sz w:val="18"/>
               </w:rPr>
-              <w:t>results/ball_drop_v2_sp_ex06_mat077_mortar</w:t>
+              <w:t>results/ball_drop_v2_dp_ex09_mat077_optimal_dp</w:t>
             </w:r>
           </w:p>
         </w:tc>
@@ -10165,7 +10195,7 @@
               <w:rPr>
                 <w:sz w:val="18"/>
               </w:rPr>
-              <w:t>Warning_40538</w:t>
+              <w:t>Warning_40533</w:t>
             </w:r>
           </w:p>
         </w:tc>
@@ -10179,7 +10209,7 @@
               <w:rPr>
                 <w:sz w:val="18"/>
               </w:rPr>
-              <w:t>DisplayImpactImplicit/3ptBending_1_00000001</w:t>
+              <w:t>2.Display3ptBendingPeridynamics/3ptBending_1_00000001</w:t>
             </w:r>
           </w:p>
         </w:tc>
@@ -10221,7 +10251,7 @@
               <w:rPr>
                 <w:sz w:val="18"/>
               </w:rPr>
-              <w:t>3</w:t>
+              <w:t>1</w:t>
             </w:r>
           </w:p>
         </w:tc>
@@ -10250,7 +10280,7 @@
               <w:rPr>
                 <w:sz w:val="18"/>
               </w:rPr>
-              <w:t>Warning_40538</w:t>
+              <w:t>Warning_40533</w:t>
             </w:r>
           </w:p>
         </w:tc>
@@ -10263,7 +10293,7 @@
               <w:rPr>
                 <w:sz w:val="18"/>
               </w:rPr>
-              <w:t>DisplayImpactShell/3ptBending_1_00000001</w:t>
+              <w:t>5.SimulationModify/DynamicRelaxation</w:t>
             </w:r>
           </w:p>
         </w:tc>
@@ -10276,7 +10306,7 @@
               <w:rPr>
                 <w:sz w:val="18"/>
               </w:rPr>
-              <w:t>INCOMPLETE</w:t>
+              <w:t>NORMAL</w:t>
             </w:r>
           </w:p>
         </w:tc>
@@ -10302,7 +10332,7 @@
               <w:rPr>
                 <w:sz w:val="18"/>
               </w:rPr>
-              <w:t>1</w:t>
+              <w:t>4</w:t>
             </w:r>
           </w:p>
         </w:tc>
@@ -10315,7 +10345,7 @@
               <w:rPr>
                 <w:sz w:val="18"/>
               </w:rPr>
-              <w:t>해석 미완료 (출력 불완전)</w:t>
+              <w:t>Hourglass energy critically high</w:t>
             </w:r>
           </w:p>
         </w:tc>
@@ -10331,7 +10361,7 @@
               <w:rPr>
                 <w:sz w:val="18"/>
               </w:rPr>
-              <w:t>에너지_발산</w:t>
+              <w:t>Warning_40538</w:t>
             </w:r>
           </w:p>
         </w:tc>
@@ -10345,7 +10375,7 @@
               <w:rPr>
                 <w:sz w:val="18"/>
               </w:rPr>
-              <w:t>alt_tet_elform60/ex05_ef60_f2000_mortar</w:t>
+              <w:t>5.SimulationModify/DynamicRelaxation</w:t>
             </w:r>
           </w:p>
         </w:tc>
@@ -10359,7 +10389,7 @@
               <w:rPr>
                 <w:sz w:val="18"/>
               </w:rPr>
-              <w:t>ERROR</w:t>
+              <w:t>NORMAL</w:t>
             </w:r>
           </w:p>
         </w:tc>
@@ -10373,7 +10403,7 @@
               <w:rPr>
                 <w:sz w:val="18"/>
               </w:rPr>
-              <w:t>10</w:t>
+              <w:t>2</w:t>
             </w:r>
           </w:p>
         </w:tc>
@@ -10387,7 +10417,7 @@
               <w:rPr>
                 <w:sz w:val="18"/>
               </w:rPr>
-              <w:t>2</w:t>
+              <w:t>4</w:t>
             </w:r>
           </w:p>
         </w:tc>
@@ -10401,7 +10431,7 @@
               <w:rPr>
                 <w:sz w:val="18"/>
               </w:rPr>
-              <w:t>해석 에러 종료</w:t>
+              <w:t>Hourglass energy critically high</w:t>
             </w:r>
           </w:p>
         </w:tc>
@@ -10416,7 +10446,7 @@
               <w:rPr>
                 <w:sz w:val="18"/>
               </w:rPr>
-              <w:t>에너지_발산</w:t>
+              <w:t>Warning_40538</w:t>
             </w:r>
           </w:p>
         </w:tc>
@@ -10429,7 +10459,7 @@
               <w:rPr>
                 <w:sz w:val="18"/>
               </w:rPr>
-              <w:t>alt_tet_elform60/ex06_ef60_f5000_mortar</w:t>
+              <w:t>DisplayImpactImplicit/3ptBending_1_00000001</w:t>
             </w:r>
           </w:p>
         </w:tc>
@@ -10442,7 +10472,7 @@
               <w:rPr>
                 <w:sz w:val="18"/>
               </w:rPr>
-              <w:t>ERROR</w:t>
+              <w:t>INCOMPLETE</w:t>
             </w:r>
           </w:p>
         </w:tc>
@@ -10455,7 +10485,7 @@
               <w:rPr>
                 <w:sz w:val="18"/>
               </w:rPr>
-              <w:t>10</w:t>
+              <w:t>2</w:t>
             </w:r>
           </w:p>
         </w:tc>
@@ -10468,7 +10498,7 @@
               <w:rPr>
                 <w:sz w:val="18"/>
               </w:rPr>
-              <w:t>1</w:t>
+              <w:t>3</w:t>
             </w:r>
           </w:p>
         </w:tc>
@@ -10481,7 +10511,7 @@
               <w:rPr>
                 <w:sz w:val="18"/>
               </w:rPr>
-              <w:t>해석 에러 종료</w:t>
+              <w:t>해석 미완료 (출력 불완전)</w:t>
             </w:r>
           </w:p>
         </w:tc>
@@ -10497,7 +10527,7 @@
               <w:rPr>
                 <w:sz w:val="18"/>
               </w:rPr>
-              <w:t>에너지_비율_폭주</w:t>
+              <w:t>에너지_발산</w:t>
             </w:r>
           </w:p>
         </w:tc>
@@ -10582,7 +10612,7 @@
               <w:rPr>
                 <w:sz w:val="18"/>
               </w:rPr>
-              <w:t>에너지_비율_폭주</w:t>
+              <w:t>에너지_발산</w:t>
             </w:r>
           </w:p>
         </w:tc>
@@ -10663,7 +10693,7 @@
               <w:rPr>
                 <w:sz w:val="18"/>
               </w:rPr>
-              <w:t>에러_종료_exit3</w:t>
+              <w:t>에너지_비율_폭주</w:t>
             </w:r>
           </w:p>
         </w:tc>
@@ -10748,7 +10778,7 @@
               <w:rPr>
                 <w:sz w:val="18"/>
               </w:rPr>
-              <w:t>에러_종료_exit3</w:t>
+              <w:t>에너지_비율_폭주</w:t>
             </w:r>
           </w:p>
         </w:tc>
@@ -10829,7 +10859,7 @@
               <w:rPr>
                 <w:sz w:val="18"/>
               </w:rPr>
-              <w:t>음수_Sliding</w:t>
+              <w:t>에러_종료_exit3</w:t>
             </w:r>
           </w:p>
         </w:tc>
@@ -10914,7 +10944,7 @@
               <w:rPr>
                 <w:sz w:val="18"/>
               </w:rPr>
-              <w:t>음수_Sliding</w:t>
+              <w:t>에러_종료_exit3</w:t>
             </w:r>
           </w:p>
         </w:tc>
@@ -10995,7 +11025,7 @@
               <w:rPr>
                 <w:sz w:val="18"/>
               </w:rPr>
-              <w:t>접촉_계산_과다</w:t>
+              <w:t>음수_Sliding</w:t>
             </w:r>
           </w:p>
         </w:tc>
@@ -11009,7 +11039,7 @@
               <w:rPr>
                 <w:sz w:val="18"/>
               </w:rPr>
-              <w:t>output/Run_20260210_045925_6d2fe3</w:t>
+              <w:t>alt_tet_elform60/ex05_ef60_f2000_mortar</w:t>
             </w:r>
           </w:p>
         </w:tc>
@@ -11023,7 +11053,7 @@
               <w:rPr>
                 <w:sz w:val="18"/>
               </w:rPr>
-              <w:t>NORMAL</w:t>
+              <w:t>ERROR</w:t>
             </w:r>
           </w:p>
         </w:tc>
@@ -11037,7 +11067,7 @@
               <w:rPr>
                 <w:sz w:val="18"/>
               </w:rPr>
-              <w:t>4</w:t>
+              <w:t>10</w:t>
             </w:r>
           </w:p>
         </w:tc>
@@ -11051,7 +11081,7 @@
               <w:rPr>
                 <w:sz w:val="18"/>
               </w:rPr>
-              <w:t>7</w:t>
+              <w:t>2</w:t>
             </w:r>
           </w:p>
         </w:tc>
@@ -11065,7 +11095,7 @@
               <w:rPr>
                 <w:sz w:val="18"/>
               </w:rPr>
-              <w:t>Hourglass energy critically high</w:t>
+              <w:t>해석 에러 종료</w:t>
             </w:r>
           </w:p>
         </w:tc>
@@ -11080,7 +11110,7 @@
               <w:rPr>
                 <w:sz w:val="18"/>
               </w:rPr>
-              <w:t>접촉_계산_과다</w:t>
+              <w:t>음수_Sliding</w:t>
             </w:r>
           </w:p>
         </w:tc>
@@ -11093,7 +11123,7 @@
               <w:rPr>
                 <w:sz w:val="18"/>
               </w:rPr>
-              <w:t>results/ball_drop_v2_dp_ex09_mat077_optimal_dp</w:t>
+              <w:t>alt_tet_elform60/ex06_ef60_f5000_mortar</w:t>
             </w:r>
           </w:p>
         </w:tc>
@@ -11119,7 +11149,7 @@
               <w:rPr>
                 <w:sz w:val="18"/>
               </w:rPr>
-              <w:t>4</w:t>
+              <w:t>10</w:t>
             </w:r>
           </w:p>
         </w:tc>
@@ -11132,7 +11162,7 @@
               <w:rPr>
                 <w:sz w:val="18"/>
               </w:rPr>
-              <w:t>3</w:t>
+              <w:t>1</w:t>
             </w:r>
           </w:p>
         </w:tc>
@@ -11161,7 +11191,7 @@
               <w:rPr>
                 <w:sz w:val="18"/>
               </w:rPr>
-              <w:t>접촉_에너지_과다</w:t>
+              <w:t>접촉_계산_과다</w:t>
             </w:r>
           </w:p>
         </w:tc>
@@ -11175,7 +11205,7 @@
               <w:rPr>
                 <w:sz w:val="18"/>
               </w:rPr>
-              <w:t>alt_tet_elform15/ex06_ef15_f5000_mortar</w:t>
+              <w:t>output/Run_20260210_045925_6d2fe3</w:t>
             </w:r>
           </w:p>
         </w:tc>
@@ -11203,7 +11233,7 @@
               <w:rPr>
                 <w:sz w:val="18"/>
               </w:rPr>
-              <w:t>5</w:t>
+              <w:t>4</w:t>
             </w:r>
           </w:p>
         </w:tc>
@@ -11217,7 +11247,7 @@
               <w:rPr>
                 <w:sz w:val="18"/>
               </w:rPr>
-              <w:t>2</w:t>
+              <w:t>7</w:t>
             </w:r>
           </w:p>
         </w:tc>
@@ -11231,7 +11261,7 @@
               <w:rPr>
                 <w:sz w:val="18"/>
               </w:rPr>
-              <w:t>Energy balance severely violated</w:t>
+              <w:t>Hourglass energy critically high</w:t>
             </w:r>
           </w:p>
         </w:tc>
@@ -11246,7 +11276,7 @@
               <w:rPr>
                 <w:sz w:val="18"/>
               </w:rPr>
-              <w:t>접촉_에너지_과다</w:t>
+              <w:t>접촉_계산_과다</w:t>
             </w:r>
           </w:p>
         </w:tc>
@@ -11259,7 +11289,7 @@
               <w:rPr>
                 <w:sz w:val="18"/>
               </w:rPr>
-              <w:t>alt_tet_elform15/ex04_ef15_f5000</w:t>
+              <w:t>results/ball_drop_v2_dp_ex09_mat077_optimal_dp</w:t>
             </w:r>
           </w:p>
         </w:tc>
@@ -11272,7 +11302,7 @@
               <w:rPr>
                 <w:sz w:val="18"/>
               </w:rPr>
-              <w:t>NORMAL</w:t>
+              <w:t>ERROR</w:t>
             </w:r>
           </w:p>
         </w:tc>
@@ -11298,7 +11328,7 @@
               <w:rPr>
                 <w:sz w:val="18"/>
               </w:rPr>
-              <w:t>2</w:t>
+              <w:t>3</w:t>
             </w:r>
           </w:p>
         </w:tc>
@@ -11311,7 +11341,7 @@
               <w:rPr>
                 <w:sz w:val="18"/>
               </w:rPr>
-              <w:t>Energy balance severely violated</w:t>
+              <w:t>해석 에러 종료</w:t>
             </w:r>
           </w:p>
         </w:tc>
@@ -11327,7 +11357,7 @@
               <w:rPr>
                 <w:sz w:val="18"/>
               </w:rPr>
-              <w:t>정상_종료</w:t>
+              <w:t>접촉_에너지_과다</w:t>
             </w:r>
           </w:p>
         </w:tc>
@@ -11341,7 +11371,7 @@
               <w:rPr>
                 <w:sz w:val="18"/>
               </w:rPr>
-              <w:t>alt_spg/ex02_sph_f1000</w:t>
+              <w:t>alt_tet_elform15/ex06_ef15_f5000_mortar</w:t>
             </w:r>
           </w:p>
         </w:tc>
@@ -11369,7 +11399,7 @@
               <w:rPr>
                 <w:sz w:val="18"/>
               </w:rPr>
-              <w:t>6</w:t>
+              <w:t>5</w:t>
             </w:r>
           </w:p>
         </w:tc>
@@ -11412,7 +11442,7 @@
               <w:rPr>
                 <w:sz w:val="18"/>
               </w:rPr>
-              <w:t>정상_종료</w:t>
+              <w:t>접촉_에너지_과다</w:t>
             </w:r>
           </w:p>
         </w:tc>
@@ -11425,7 +11455,7 @@
               <w:rPr>
                 <w:sz w:val="18"/>
               </w:rPr>
-              <w:t>alt_spg/ex04_sph_f5000</w:t>
+              <w:t>alt_tet_elform15/ex04_ef15_f5000</w:t>
             </w:r>
           </w:p>
         </w:tc>
@@ -11451,7 +11481,7 @@
               <w:rPr>
                 <w:sz w:val="18"/>
               </w:rPr>
-              <w:t>6</w:t>
+              <w:t>4</w:t>
             </w:r>
           </w:p>
         </w:tc>
@@ -11493,7 +11523,7 @@
               <w:rPr>
                 <w:sz w:val="18"/>
               </w:rPr>
-              <w:t>타임스텝_붕괴</w:t>
+              <w:t>정상_종료</w:t>
             </w:r>
           </w:p>
         </w:tc>
@@ -11507,7 +11537,7 @@
               <w:rPr>
                 <w:sz w:val="18"/>
               </w:rPr>
-              <w:t>results/level_study_ex06_tet4_ef60_dt0</w:t>
+              <w:t>alt_spg/ex02_sph_f1000</w:t>
             </w:r>
           </w:p>
         </w:tc>
@@ -11521,7 +11551,7 @@
               <w:rPr>
                 <w:sz w:val="18"/>
               </w:rPr>
-              <w:t>ERROR</w:t>
+              <w:t>NORMAL</w:t>
             </w:r>
           </w:p>
         </w:tc>
@@ -11535,7 +11565,7 @@
               <w:rPr>
                 <w:sz w:val="18"/>
               </w:rPr>
-              <w:t>9</w:t>
+              <w:t>6</w:t>
             </w:r>
           </w:p>
         </w:tc>
@@ -11549,7 +11579,7 @@
               <w:rPr>
                 <w:sz w:val="18"/>
               </w:rPr>
-              <w:t>1</w:t>
+              <w:t>2</w:t>
             </w:r>
           </w:p>
         </w:tc>
@@ -11557,6 +11587,252 @@
           <w:tcPr>
             <w:tcW w:type="dxa" w:w="3456"/>
             <w:shd w:val="clear" w:color="auto" w:fill="EEF2F9"/>
+          </w:tcPr>
+          <w:p>
+            <w:r>
+              <w:rPr>
+                <w:sz w:val="18"/>
+              </w:rPr>
+              <w:t>Energy balance severely violated</w:t>
+            </w:r>
+          </w:p>
+        </w:tc>
+      </w:tr>
+      <w:tr>
+        <w:tc>
+          <w:tcPr>
+            <w:tcW w:type="dxa" w:w="2160"/>
+          </w:tcPr>
+          <w:p>
+            <w:r>
+              <w:rPr>
+                <w:sz w:val="18"/>
+              </w:rPr>
+              <w:t>정상_종료</w:t>
+            </w:r>
+          </w:p>
+        </w:tc>
+        <w:tc>
+          <w:tcPr>
+            <w:tcW w:type="dxa" w:w="2160"/>
+          </w:tcPr>
+          <w:p>
+            <w:r>
+              <w:rPr>
+                <w:sz w:val="18"/>
+              </w:rPr>
+              <w:t>alt_spg/ex04_sph_f5000</w:t>
+            </w:r>
+          </w:p>
+        </w:tc>
+        <w:tc>
+          <w:tcPr>
+            <w:tcW w:type="dxa" w:w="1152"/>
+          </w:tcPr>
+          <w:p>
+            <w:r>
+              <w:rPr>
+                <w:sz w:val="18"/>
+              </w:rPr>
+              <w:t>NORMAL</w:t>
+            </w:r>
+          </w:p>
+        </w:tc>
+        <w:tc>
+          <w:tcPr>
+            <w:tcW w:type="dxa" w:w="576"/>
+          </w:tcPr>
+          <w:p>
+            <w:r>
+              <w:rPr>
+                <w:sz w:val="18"/>
+              </w:rPr>
+              <w:t>6</w:t>
+            </w:r>
+          </w:p>
+        </w:tc>
+        <w:tc>
+          <w:tcPr>
+            <w:tcW w:type="dxa" w:w="576"/>
+          </w:tcPr>
+          <w:p>
+            <w:r>
+              <w:rPr>
+                <w:sz w:val="18"/>
+              </w:rPr>
+              <w:t>2</w:t>
+            </w:r>
+          </w:p>
+        </w:tc>
+        <w:tc>
+          <w:tcPr>
+            <w:tcW w:type="dxa" w:w="3456"/>
+          </w:tcPr>
+          <w:p>
+            <w:r>
+              <w:rPr>
+                <w:sz w:val="18"/>
+              </w:rPr>
+              <w:t>Energy balance severely violated</w:t>
+            </w:r>
+          </w:p>
+        </w:tc>
+      </w:tr>
+      <w:tr>
+        <w:tc>
+          <w:tcPr>
+            <w:tcW w:type="dxa" w:w="2160"/>
+            <w:shd w:val="clear" w:color="auto" w:fill="EEF2F9"/>
+          </w:tcPr>
+          <w:p>
+            <w:r>
+              <w:rPr>
+                <w:sz w:val="18"/>
+              </w:rPr>
+              <w:t>타임스텝_붕괴</w:t>
+            </w:r>
+          </w:p>
+        </w:tc>
+        <w:tc>
+          <w:tcPr>
+            <w:tcW w:type="dxa" w:w="2160"/>
+            <w:shd w:val="clear" w:color="auto" w:fill="EEF2F9"/>
+          </w:tcPr>
+          <w:p>
+            <w:r>
+              <w:rPr>
+                <w:sz w:val="18"/>
+              </w:rPr>
+              <w:t>1.DisplayImpactBallPeridynamics/Impact_1_00000001</w:t>
+            </w:r>
+          </w:p>
+        </w:tc>
+        <w:tc>
+          <w:tcPr>
+            <w:tcW w:type="dxa" w:w="1152"/>
+            <w:shd w:val="clear" w:color="auto" w:fill="EEF2F9"/>
+          </w:tcPr>
+          <w:p>
+            <w:r>
+              <w:rPr>
+                <w:sz w:val="18"/>
+              </w:rPr>
+              <w:t>ERROR</w:t>
+            </w:r>
+          </w:p>
+        </w:tc>
+        <w:tc>
+          <w:tcPr>
+            <w:tcW w:type="dxa" w:w="576"/>
+            <w:shd w:val="clear" w:color="auto" w:fill="EEF2F9"/>
+          </w:tcPr>
+          <w:p>
+            <w:r>
+              <w:rPr>
+                <w:sz w:val="18"/>
+              </w:rPr>
+              <w:t>9</w:t>
+            </w:r>
+          </w:p>
+        </w:tc>
+        <w:tc>
+          <w:tcPr>
+            <w:tcW w:type="dxa" w:w="576"/>
+            <w:shd w:val="clear" w:color="auto" w:fill="EEF2F9"/>
+          </w:tcPr>
+          <w:p>
+            <w:r>
+              <w:rPr>
+                <w:sz w:val="18"/>
+              </w:rPr>
+              <w:t>4</w:t>
+            </w:r>
+          </w:p>
+        </w:tc>
+        <w:tc>
+          <w:tcPr>
+            <w:tcW w:type="dxa" w:w="3456"/>
+            <w:shd w:val="clear" w:color="auto" w:fill="EEF2F9"/>
+          </w:tcPr>
+          <w:p>
+            <w:r>
+              <w:rPr>
+                <w:sz w:val="18"/>
+              </w:rPr>
+              <w:t>해석 에러 종료</w:t>
+            </w:r>
+          </w:p>
+        </w:tc>
+      </w:tr>
+      <w:tr>
+        <w:tc>
+          <w:tcPr>
+            <w:tcW w:type="dxa" w:w="2160"/>
+          </w:tcPr>
+          <w:p>
+            <w:r>
+              <w:rPr>
+                <w:sz w:val="18"/>
+              </w:rPr>
+              <w:t>타임스텝_붕괴</w:t>
+            </w:r>
+          </w:p>
+        </w:tc>
+        <w:tc>
+          <w:tcPr>
+            <w:tcW w:type="dxa" w:w="2160"/>
+          </w:tcPr>
+          <w:p>
+            <w:r>
+              <w:rPr>
+                <w:sz w:val="18"/>
+              </w:rPr>
+              <w:t>results/level_study_ex06_tet4_ef60_dt0</w:t>
+            </w:r>
+          </w:p>
+        </w:tc>
+        <w:tc>
+          <w:tcPr>
+            <w:tcW w:type="dxa" w:w="1152"/>
+          </w:tcPr>
+          <w:p>
+            <w:r>
+              <w:rPr>
+                <w:sz w:val="18"/>
+              </w:rPr>
+              <w:t>ERROR</w:t>
+            </w:r>
+          </w:p>
+        </w:tc>
+        <w:tc>
+          <w:tcPr>
+            <w:tcW w:type="dxa" w:w="576"/>
+          </w:tcPr>
+          <w:p>
+            <w:r>
+              <w:rPr>
+                <w:sz w:val="18"/>
+              </w:rPr>
+              <w:t>9</w:t>
+            </w:r>
+          </w:p>
+        </w:tc>
+        <w:tc>
+          <w:tcPr>
+            <w:tcW w:type="dxa" w:w="576"/>
+          </w:tcPr>
+          <w:p>
+            <w:r>
+              <w:rPr>
+                <w:sz w:val="18"/>
+              </w:rPr>
+              <w:t>1</w:t>
+            </w:r>
+          </w:p>
+        </w:tc>
+        <w:tc>
+          <w:tcPr>
+            <w:tcW w:type="dxa" w:w="3456"/>
           </w:tcPr>
           <w:p>
             <w:r>

</xml_diff>

<commit_message>
2차 배치 분석 완료 (matsum/element_mapper/implicit 진단 적용)
- 재분석 대상: 2,407개 전체 (새 기능 5종 반영)
- reports2/ HTML 갱신: 42개
- /data/koodyna_reports JSON 리포트: 2241개
- FEATURE_STATUS_REPORT.docx 섹션 11 최종 업데이트
- KooDynaAnalyzer_demo.zip 재생성

추가된 분석 기능:
- matsum 재료별 Hourglass 진단
- element_mapper 파트 ID 보완
- nodout/bndout 부재 안내 Finding
- Implicit solver 수렴 진단

Co-Authored-By: Claude Sonnet 4.6 <noreply@anthropic.com>
</commit_message>
<xml_diff>
--- a/FEATURE_STATUS_REPORT.docx
+++ b/FEATURE_STATUS_REPORT.docx
@@ -7231,7 +7231,7 @@
               <w:rPr>
                 <w:sz w:val="18"/>
               </w:rPr>
-              <w:t>1,801개</w:t>
+              <w:t>2,251개</w:t>
             </w:r>
           </w:p>
         </w:tc>
@@ -7259,7 +7259,7 @@
               <w:rPr>
                 <w:sz w:val="18"/>
               </w:rPr>
-              <w:t>1,414개</w:t>
+              <w:t>2,158개</w:t>
             </w:r>
           </w:p>
         </w:tc>
@@ -7289,7 +7289,7 @@
               <w:rPr>
                 <w:sz w:val="18"/>
               </w:rPr>
-              <w:t>22개</w:t>
+              <w:t>48개</w:t>
             </w:r>
           </w:p>
         </w:tc>
@@ -7317,7 +7317,7 @@
               <w:rPr>
                 <w:sz w:val="18"/>
               </w:rPr>
-              <w:t>365개</w:t>
+              <w:t>45개</w:t>
             </w:r>
           </w:p>
         </w:tc>
@@ -7375,7 +7375,7 @@
               <w:rPr>
                 <w:sz w:val="18"/>
               </w:rPr>
-              <w:t>4,476건</w:t>
+              <w:t>5,660건</w:t>
             </w:r>
           </w:p>
         </w:tc>
@@ -7405,7 +7405,7 @@
               <w:rPr>
                 <w:sz w:val="18"/>
               </w:rPr>
-              <w:t>6,104건</w:t>
+              <w:t>10,450건</w:t>
             </w:r>
           </w:p>
         </w:tc>
@@ -7490,7 +7490,7 @@
               <w:rPr>
                 <w:sz w:val="18"/>
               </w:rPr>
-              <w:t>845</w:t>
+              <w:t>1,285</w:t>
             </w:r>
           </w:p>
         </w:tc>
@@ -7518,7 +7518,7 @@
               <w:rPr>
                 <w:sz w:val="18"/>
               </w:rPr>
-              <w:t>840</w:t>
+              <w:t>1,262</w:t>
             </w:r>
           </w:p>
         </w:tc>
@@ -7548,7 +7548,7 @@
               <w:rPr>
                 <w:sz w:val="18"/>
               </w:rPr>
-              <w:t>405</w:t>
+              <w:t>410</w:t>
             </w:r>
           </w:p>
         </w:tc>
@@ -7563,7 +7563,7 @@
               <w:rPr>
                 <w:sz w:val="18"/>
               </w:rPr>
-              <w:t>해석 미완료 (출력 불완전)</w:t>
+              <w:t>Negative sliding interface energy (-7.212E-06)</w:t>
             </w:r>
           </w:p>
         </w:tc>
@@ -7576,7 +7576,7 @@
               <w:rPr>
                 <w:sz w:val="18"/>
               </w:rPr>
-              <w:t>365</w:t>
+              <w:t>166</w:t>
             </w:r>
           </w:p>
         </w:tc>
@@ -7592,7 +7592,7 @@
               <w:rPr>
                 <w:sz w:val="18"/>
               </w:rPr>
-              <w:t>Energy balance severely violated</w:t>
+              <w:t>Negative sliding interface energy (-7.213E-06)</w:t>
             </w:r>
           </w:p>
         </w:tc>
@@ -7606,7 +7606,7 @@
               <w:rPr>
                 <w:sz w:val="18"/>
               </w:rPr>
-              <w:t>138</w:t>
+              <w:t>163</w:t>
             </w:r>
           </w:p>
         </w:tc>
@@ -7621,7 +7621,7 @@
               <w:rPr>
                 <w:sz w:val="18"/>
               </w:rPr>
-              <w:t>Negative sliding interface energy (-7.212E-06)</w:t>
+              <w:t>Negative sliding interface energy (-7.211E-06)</w:t>
             </w:r>
           </w:p>
         </w:tc>
@@ -7634,7 +7634,7 @@
               <w:rPr>
                 <w:sz w:val="18"/>
               </w:rPr>
-              <w:t>115</w:t>
+              <w:t>160</w:t>
             </w:r>
           </w:p>
         </w:tc>
@@ -7650,7 +7650,7 @@
               <w:rPr>
                 <w:sz w:val="18"/>
               </w:rPr>
-              <w:t>Negative sliding interface energy (-7.213E-06)</w:t>
+              <w:t>Energy balance severely violated</w:t>
             </w:r>
           </w:p>
         </w:tc>
@@ -7664,7 +7664,7 @@
               <w:rPr>
                 <w:sz w:val="18"/>
               </w:rPr>
-              <w:t>107</w:t>
+              <w:t>143</w:t>
             </w:r>
           </w:p>
         </w:tc>
@@ -7679,7 +7679,7 @@
               <w:rPr>
                 <w:sz w:val="18"/>
               </w:rPr>
-              <w:t>Negative sliding interface energy (-7.211E-06)</w:t>
+              <w:t>Negative sliding interface energy (-7.214E-06)</w:t>
             </w:r>
           </w:p>
         </w:tc>
@@ -7692,7 +7692,7 @@
               <w:rPr>
                 <w:sz w:val="18"/>
               </w:rPr>
-              <w:t>102</w:t>
+              <w:t>139</w:t>
             </w:r>
           </w:p>
         </w:tc>
@@ -7708,7 +7708,7 @@
               <w:rPr>
                 <w:sz w:val="18"/>
               </w:rPr>
-              <w:t>Negative sliding interface energy (-7.214E-06)</w:t>
+              <w:t>Negative sliding interface energy (-7.215E-06)</w:t>
             </w:r>
           </w:p>
         </w:tc>
@@ -7722,7 +7722,7 @@
               <w:rPr>
                 <w:sz w:val="18"/>
               </w:rPr>
-              <w:t>89</w:t>
+              <w:t>118</w:t>
             </w:r>
           </w:p>
         </w:tc>
@@ -7737,7 +7737,7 @@
               <w:rPr>
                 <w:sz w:val="18"/>
               </w:rPr>
-              <w:t>LS-DYNA exit code 3</w:t>
+              <w:t>Negative sliding interface energy (-7.210E-06)</w:t>
             </w:r>
           </w:p>
         </w:tc>
@@ -7750,7 +7750,7 @@
               <w:rPr>
                 <w:sz w:val="18"/>
               </w:rPr>
-              <w:t>82</w:t>
+              <w:t>92</w:t>
             </w:r>
           </w:p>
         </w:tc>
@@ -7766,7 +7766,7 @@
               <w:rPr>
                 <w:sz w:val="18"/>
               </w:rPr>
-              <w:t>Negative sliding interface energy (-7.215E-06)</w:t>
+              <w:t>Negative sliding interface energy (-7.216E-06)</w:t>
             </w:r>
           </w:p>
         </w:tc>
@@ -7780,7 +7780,7 @@
               <w:rPr>
                 <w:sz w:val="18"/>
               </w:rPr>
-              <w:t>78</w:t>
+              <w:t>87</w:t>
             </w:r>
           </w:p>
         </w:tc>
@@ -7795,7 +7795,7 @@
               <w:rPr>
                 <w:sz w:val="18"/>
               </w:rPr>
-              <w:t>Negative sliding interface energy (-7.210E-06)</w:t>
+              <w:t>LS-DYNA exit code 3</w:t>
             </w:r>
           </w:p>
         </w:tc>
@@ -7808,7 +7808,7 @@
               <w:rPr>
                 <w:sz w:val="18"/>
               </w:rPr>
-              <w:t>60</w:t>
+              <w:t>85</w:t>
             </w:r>
           </w:p>
         </w:tc>
@@ -7824,7 +7824,7 @@
               <w:rPr>
                 <w:sz w:val="18"/>
               </w:rPr>
-              <w:t>Negative sliding interface energy (-7.216E-06)</w:t>
+              <w:t>Negative sliding interface energy (-7.209E-06)</w:t>
             </w:r>
           </w:p>
         </w:tc>
@@ -7838,7 +7838,7 @@
               <w:rPr>
                 <w:sz w:val="18"/>
               </w:rPr>
-              <w:t>48</w:t>
+              <w:t>65</w:t>
             </w:r>
           </w:p>
         </w:tc>
@@ -7853,7 +7853,7 @@
               <w:rPr>
                 <w:sz w:val="18"/>
               </w:rPr>
-              <w:t>Kinetic energy explosion (100x in 6.000E-01s)</w:t>
+              <w:t>Negative sliding interface energy (-7.208E-06)</w:t>
             </w:r>
           </w:p>
         </w:tc>
@@ -7866,7 +7866,7 @@
               <w:rPr>
                 <w:sz w:val="18"/>
               </w:rPr>
-              <w:t>44</w:t>
+              <w:t>55</w:t>
             </w:r>
           </w:p>
         </w:tc>
@@ -7882,7 +7882,7 @@
               <w:rPr>
                 <w:sz w:val="18"/>
               </w:rPr>
-              <w:t>Negative sliding interface energy (-7.209E-06)</w:t>
+              <w:t>Negative sliding interface energy (-7.207E-06)</w:t>
             </w:r>
           </w:p>
         </w:tc>
@@ -7896,7 +7896,7 @@
               <w:rPr>
                 <w:sz w:val="18"/>
               </w:rPr>
-              <w:t>43</w:t>
+              <w:t>51</w:t>
             </w:r>
           </w:p>
         </w:tc>
@@ -7981,7 +7981,7 @@
               <w:rPr>
                 <w:sz w:val="18"/>
               </w:rPr>
-              <w:t>11,398,658</w:t>
+              <w:t>17,404,196</w:t>
             </w:r>
           </w:p>
         </w:tc>
@@ -8009,7 +8009,7 @@
               <w:rPr>
                 <w:sz w:val="18"/>
               </w:rPr>
-              <w:t>683,939</w:t>
+              <w:t>1,044,236</w:t>
             </w:r>
           </w:p>
         </w:tc>
@@ -8083,7 +8083,7 @@
               <w:rPr>
                 <w:sz w:val="18"/>
               </w:rPr>
-              <w:t>Warning/Error 40533</w:t>
+              <w:t>Warning/Error 20268</w:t>
             </w:r>
           </w:p>
         </w:tc>
@@ -8097,7 +8097,7 @@
               <w:rPr>
                 <w:sz w:val="18"/>
               </w:rPr>
-              <w:t>18,712</w:t>
+              <w:t>22,498</w:t>
             </w:r>
           </w:p>
         </w:tc>
@@ -8112,7 +8112,7 @@
               <w:rPr>
                 <w:sz w:val="18"/>
               </w:rPr>
-              <w:t>Warning/Error 50134</w:t>
+              <w:t>Warning/Error 40533</w:t>
             </w:r>
           </w:p>
         </w:tc>
@@ -8125,7 +8125,7 @@
               <w:rPr>
                 <w:sz w:val="18"/>
               </w:rPr>
-              <w:t>8,651</w:t>
+              <w:t>18,712</w:t>
             </w:r>
           </w:p>
         </w:tc>
@@ -8141,7 +8141,7 @@
               <w:rPr>
                 <w:sz w:val="18"/>
               </w:rPr>
-              <w:t>Warning/Error 30062</w:t>
+              <w:t>Warning/Error 41314</w:t>
             </w:r>
           </w:p>
         </w:tc>
@@ -8155,7 +8155,7 @@
               <w:rPr>
                 <w:sz w:val="18"/>
               </w:rPr>
-              <w:t>7,708</w:t>
+              <w:t>12,844</w:t>
             </w:r>
           </w:p>
         </w:tc>
@@ -8170,7 +8170,7 @@
               <w:rPr>
                 <w:sz w:val="18"/>
               </w:rPr>
-              <w:t>Warning/Error 40532</w:t>
+              <w:t>Warning/Error 50134</w:t>
             </w:r>
           </w:p>
         </w:tc>
@@ -8183,7 +8183,7 @@
               <w:rPr>
                 <w:sz w:val="18"/>
               </w:rPr>
-              <w:t>5,245</w:t>
+              <w:t>8,651</w:t>
             </w:r>
           </w:p>
         </w:tc>
@@ -8199,7 +8199,7 @@
               <w:rPr>
                 <w:sz w:val="18"/>
               </w:rPr>
-              <w:t>Warning/Error 40540</w:t>
+              <w:t>Warning/Error 30062</w:t>
             </w:r>
           </w:p>
         </w:tc>
@@ -8213,7 +8213,7 @@
               <w:rPr>
                 <w:sz w:val="18"/>
               </w:rPr>
-              <w:t>1,158</w:t>
+              <w:t>7,708</w:t>
             </w:r>
           </w:p>
         </w:tc>
@@ -8228,7 +8228,7 @@
               <w:rPr>
                 <w:sz w:val="18"/>
               </w:rPr>
-              <w:t>Warning/Error 60121</w:t>
+              <w:t>Warning/Error 40532</w:t>
             </w:r>
           </w:p>
         </w:tc>
@@ -8241,7 +8241,7 @@
               <w:rPr>
                 <w:sz w:val="18"/>
               </w:rPr>
-              <w:t>661</w:t>
+              <w:t>5,245</w:t>
             </w:r>
           </w:p>
         </w:tc>
@@ -8257,7 +8257,7 @@
               <w:rPr>
                 <w:sz w:val="18"/>
               </w:rPr>
-              <w:t>Warning/Error 40565</w:t>
+              <w:t>Warning/Error 40540</w:t>
             </w:r>
           </w:p>
         </w:tc>
@@ -8271,7 +8271,7 @@
               <w:rPr>
                 <w:sz w:val="18"/>
               </w:rPr>
-              <w:t>180</w:t>
+              <w:t>1,158</w:t>
             </w:r>
           </w:p>
         </w:tc>
@@ -8286,7 +8286,7 @@
               <w:rPr>
                 <w:sz w:val="18"/>
               </w:rPr>
-              <w:t>Warning/Error 30060</w:t>
+              <w:t>Warning/Error 60121</w:t>
             </w:r>
           </w:p>
         </w:tc>
@@ -8299,7 +8299,7 @@
               <w:rPr>
                 <w:sz w:val="18"/>
               </w:rPr>
-              <w:t>144</w:t>
+              <w:t>661</w:t>
             </w:r>
           </w:p>
         </w:tc>
@@ -8315,7 +8315,7 @@
               <w:rPr>
                 <w:sz w:val="18"/>
               </w:rPr>
-              <w:t>Warning/Error 40864</w:t>
+              <w:t>Warning/Error 40565</w:t>
             </w:r>
           </w:p>
         </w:tc>
@@ -8329,7 +8329,7 @@
               <w:rPr>
                 <w:sz w:val="18"/>
               </w:rPr>
-              <w:t>91</w:t>
+              <w:t>180</w:t>
             </w:r>
           </w:p>
         </w:tc>
@@ -8344,7 +8344,7 @@
               <w:rPr>
                 <w:sz w:val="18"/>
               </w:rPr>
-              <w:t>Warning/Error 30210</w:t>
+              <w:t>Warning/Error 30060</w:t>
             </w:r>
           </w:p>
         </w:tc>
@@ -8357,7 +8357,7 @@
               <w:rPr>
                 <w:sz w:val="18"/>
               </w:rPr>
-              <w:t>78</w:t>
+              <w:t>144</w:t>
             </w:r>
           </w:p>
         </w:tc>
@@ -8373,7 +8373,7 @@
               <w:rPr>
                 <w:sz w:val="18"/>
               </w:rPr>
-              <w:t>Warning/Error 40534</w:t>
+              <w:t>Warning/Error 40864</w:t>
             </w:r>
           </w:p>
         </w:tc>
@@ -8387,7 +8387,7 @@
               <w:rPr>
                 <w:sz w:val="18"/>
               </w:rPr>
-              <w:t>68</w:t>
+              <w:t>91</w:t>
             </w:r>
           </w:p>
         </w:tc>
@@ -8577,7 +8577,7 @@
               <w:rPr>
                 <w:sz w:val="18"/>
               </w:rPr>
-              <w:t>9</w:t>
+              <w:t>10</w:t>
             </w:r>
           </w:p>
         </w:tc>
@@ -8672,7 +8672,7 @@
               <w:rPr>
                 <w:sz w:val="18"/>
               </w:rPr>
-              <w:t>2</w:t>
+              <w:t>5</w:t>
             </w:r>
           </w:p>
         </w:tc>
@@ -8757,7 +8757,7 @@
               <w:rPr>
                 <w:sz w:val="18"/>
               </w:rPr>
-              <w:t>2</w:t>
+              <w:t>4</w:t>
             </w:r>
           </w:p>
         </w:tc>
@@ -8812,7 +8812,7 @@
               <w:rPr>
                 <w:sz w:val="18"/>
               </w:rPr>
-              <w:t>INCOMPLETE</w:t>
+              <w:t>ERROR</w:t>
             </w:r>
           </w:p>
         </w:tc>
@@ -8838,7 +8838,7 @@
               <w:rPr>
                 <w:sz w:val="18"/>
               </w:rPr>
-              <w:t>3</w:t>
+              <w:t>4</w:t>
             </w:r>
           </w:p>
         </w:tc>
@@ -8851,7 +8851,7 @@
               <w:rPr>
                 <w:sz w:val="18"/>
               </w:rPr>
-              <w:t>해석 미완료 (출력 불완전)</w:t>
+              <w:t>해석 에러 종료</w:t>
             </w:r>
           </w:p>
         </w:tc>
@@ -8923,7 +8923,7 @@
               <w:rPr>
                 <w:sz w:val="18"/>
               </w:rPr>
-              <w:t>2</w:t>
+              <w:t>4</w:t>
             </w:r>
           </w:p>
         </w:tc>
@@ -9004,7 +9004,7 @@
               <w:rPr>
                 <w:sz w:val="18"/>
               </w:rPr>
-              <w:t>1</w:t>
+              <w:t>3</w:t>
             </w:r>
           </w:p>
         </w:tc>
@@ -9089,7 +9089,7 @@
               <w:rPr>
                 <w:sz w:val="18"/>
               </w:rPr>
-              <w:t>1</w:t>
+              <w:t>3</w:t>
             </w:r>
           </w:p>
         </w:tc>
@@ -9170,7 +9170,7 @@
               <w:rPr>
                 <w:sz w:val="18"/>
               </w:rPr>
-              <w:t>1</w:t>
+              <w:t>3</w:t>
             </w:r>
           </w:p>
         </w:tc>
@@ -9213,7 +9213,7 @@
               <w:rPr>
                 <w:sz w:val="18"/>
               </w:rPr>
-              <w:t>group1a_dynamic/case1a1</w:t>
+              <w:t>viscoelasticityTest_3D_YZforce/viscoelastic_YZdir</w:t>
             </w:r>
           </w:p>
         </w:tc>
@@ -9227,7 +9227,7 @@
               <w:rPr>
                 <w:sz w:val="18"/>
               </w:rPr>
-              <w:t>NORMAL</w:t>
+              <w:t>ERROR</w:t>
             </w:r>
           </w:p>
         </w:tc>
@@ -9241,7 +9241,7 @@
               <w:rPr>
                 <w:sz w:val="18"/>
               </w:rPr>
-              <w:t>6</w:t>
+              <w:t>8</w:t>
             </w:r>
           </w:p>
         </w:tc>
@@ -9255,7 +9255,7 @@
               <w:rPr>
                 <w:sz w:val="18"/>
               </w:rPr>
-              <w:t>1</w:t>
+              <w:t>3</w:t>
             </w:r>
           </w:p>
         </w:tc>
@@ -9269,7 +9269,7 @@
               <w:rPr>
                 <w:sz w:val="18"/>
               </w:rPr>
-              <w:t>Energy balance severely violated</w:t>
+              <w:t>해석 에러 종료</w:t>
             </w:r>
           </w:p>
         </w:tc>
@@ -9297,7 +9297,7 @@
               <w:rPr>
                 <w:sz w:val="18"/>
               </w:rPr>
-              <w:t>group1b_quasistatic/case1b1</w:t>
+              <w:t>viscoelasticityTest_3D_YZforce/viscoelastic_YZdir_slack</w:t>
             </w:r>
           </w:p>
         </w:tc>
@@ -9310,7 +9310,7 @@
               <w:rPr>
                 <w:sz w:val="18"/>
               </w:rPr>
-              <w:t>NORMAL</w:t>
+              <w:t>ERROR</w:t>
             </w:r>
           </w:p>
         </w:tc>
@@ -9323,7 +9323,7 @@
               <w:rPr>
                 <w:sz w:val="18"/>
               </w:rPr>
-              <w:t>6</w:t>
+              <w:t>8</w:t>
             </w:r>
           </w:p>
         </w:tc>
@@ -9336,7 +9336,7 @@
               <w:rPr>
                 <w:sz w:val="18"/>
               </w:rPr>
-              <w:t>4</w:t>
+              <w:t>3</w:t>
             </w:r>
           </w:p>
         </w:tc>
@@ -9349,7 +9349,7 @@
               <w:rPr>
                 <w:sz w:val="18"/>
               </w:rPr>
-              <w:t>Energy balance severely violated</w:t>
+              <w:t>해석 에러 종료</w:t>
             </w:r>
           </w:p>
         </w:tc>
@@ -9421,7 +9421,7 @@
               <w:rPr>
                 <w:sz w:val="18"/>
               </w:rPr>
-              <w:t>2</w:t>
+              <w:t>4</w:t>
             </w:r>
           </w:p>
         </w:tc>
@@ -9502,7 +9502,7 @@
               <w:rPr>
                 <w:sz w:val="18"/>
               </w:rPr>
-              <w:t>1</w:t>
+              <w:t>3</w:t>
             </w:r>
           </w:p>
         </w:tc>
@@ -9587,7 +9587,7 @@
               <w:rPr>
                 <w:sz w:val="18"/>
               </w:rPr>
-              <w:t>1</w:t>
+              <w:t>3</w:t>
             </w:r>
           </w:p>
         </w:tc>
@@ -9668,7 +9668,7 @@
               <w:rPr>
                 <w:sz w:val="18"/>
               </w:rPr>
-              <w:t>1</w:t>
+              <w:t>3</w:t>
             </w:r>
           </w:p>
         </w:tc>
@@ -9753,7 +9753,7 @@
               <w:rPr>
                 <w:sz w:val="18"/>
               </w:rPr>
-              <w:t>2</w:t>
+              <w:t>4</w:t>
             </w:r>
           </w:p>
         </w:tc>
@@ -9834,7 +9834,7 @@
               <w:rPr>
                 <w:sz w:val="18"/>
               </w:rPr>
-              <w:t>2</w:t>
+              <w:t>4</w:t>
             </w:r>
           </w:p>
         </w:tc>
@@ -9905,7 +9905,7 @@
               <w:rPr>
                 <w:sz w:val="18"/>
               </w:rPr>
-              <w:t>9</w:t>
+              <w:t>10</w:t>
             </w:r>
           </w:p>
         </w:tc>
@@ -9974,7 +9974,7 @@
               <w:rPr>
                 <w:sz w:val="18"/>
               </w:rPr>
-              <w:t>INCOMPLETE</w:t>
+              <w:t>ERROR</w:t>
             </w:r>
           </w:p>
         </w:tc>
@@ -9987,7 +9987,7 @@
               <w:rPr>
                 <w:sz w:val="18"/>
               </w:rPr>
-              <w:t>7</w:t>
+              <w:t>8</w:t>
             </w:r>
           </w:p>
         </w:tc>
@@ -10000,7 +10000,7 @@
               <w:rPr>
                 <w:sz w:val="18"/>
               </w:rPr>
-              <w:t>1</w:t>
+              <w:t>3</w:t>
             </w:r>
           </w:p>
         </w:tc>
@@ -10013,7 +10013,7 @@
               <w:rPr>
                 <w:sz w:val="18"/>
               </w:rPr>
-              <w:t>해석 미완료 (출력 불완전)</w:t>
+              <w:t>해석 에러 종료</w:t>
             </w:r>
           </w:p>
         </w:tc>
@@ -10085,7 +10085,7 @@
               <w:rPr>
                 <w:sz w:val="18"/>
               </w:rPr>
-              <w:t>2</w:t>
+              <w:t>4</w:t>
             </w:r>
           </w:p>
         </w:tc>
@@ -10166,7 +10166,7 @@
               <w:rPr>
                 <w:sz w:val="18"/>
               </w:rPr>
-              <w:t>2</w:t>
+              <w:t>4</w:t>
             </w:r>
           </w:p>
         </w:tc>
@@ -10209,7 +10209,7 @@
               <w:rPr>
                 <w:sz w:val="18"/>
               </w:rPr>
-              <w:t>output/Run_20260210_022052_e4ac3e</w:t>
+              <w:t>output/Run_20260207_212447_f1e2c8</w:t>
             </w:r>
           </w:p>
         </w:tc>
@@ -10293,7 +10293,7 @@
               <w:rPr>
                 <w:sz w:val="18"/>
               </w:rPr>
-              <w:t>output/Run_20260210_023157_5b9f6b</w:t>
+              <w:t>output/Run_20260207_215848_375fcb</w:t>
             </w:r>
           </w:p>
         </w:tc>
@@ -10332,7 +10332,7 @@
               <w:rPr>
                 <w:sz w:val="18"/>
               </w:rPr>
-              <w:t>5</w:t>
+              <w:t>6</w:t>
             </w:r>
           </w:p>
         </w:tc>
@@ -10375,7 +10375,7 @@
               <w:rPr>
                 <w:sz w:val="18"/>
               </w:rPr>
-              <w:t>2.Display3ptBendingPeridynamics/3ptBending_1_00000001</w:t>
+              <w:t>5.SimulationModify/DynamicRelaxation</w:t>
             </w:r>
           </w:p>
         </w:tc>
@@ -10389,7 +10389,7 @@
               <w:rPr>
                 <w:sz w:val="18"/>
               </w:rPr>
-              <w:t>INCOMPLETE</w:t>
+              <w:t>NORMAL</w:t>
             </w:r>
           </w:p>
         </w:tc>
@@ -10403,7 +10403,7 @@
               <w:rPr>
                 <w:sz w:val="18"/>
               </w:rPr>
-              <w:t>2</w:t>
+              <w:t>3</w:t>
             </w:r>
           </w:p>
         </w:tc>
@@ -10417,7 +10417,7 @@
               <w:rPr>
                 <w:sz w:val="18"/>
               </w:rPr>
-              <w:t>1</w:t>
+              <w:t>5</w:t>
             </w:r>
           </w:p>
         </w:tc>
@@ -10431,7 +10431,7 @@
               <w:rPr>
                 <w:sz w:val="18"/>
               </w:rPr>
-              <w:t>해석 미완료 (출력 불완전)</w:t>
+              <w:t>Hourglass energy critically high</w:t>
             </w:r>
           </w:p>
         </w:tc>
@@ -10459,7 +10459,7 @@
               <w:rPr>
                 <w:sz w:val="18"/>
               </w:rPr>
-              <w:t>5.SimulationModify/DynamicRelaxation</w:t>
+              <w:t>2.Display3ptBendingPeridynamics/3ptBending_1_00000001</w:t>
             </w:r>
           </w:p>
         </w:tc>
@@ -10472,7 +10472,7 @@
               <w:rPr>
                 <w:sz w:val="18"/>
               </w:rPr>
-              <w:t>NORMAL</w:t>
+              <w:t>INCOMPLETE</w:t>
             </w:r>
           </w:p>
         </w:tc>
@@ -10498,7 +10498,7 @@
               <w:rPr>
                 <w:sz w:val="18"/>
               </w:rPr>
-              <w:t>4</w:t>
+              <w:t>1</w:t>
             </w:r>
           </w:p>
         </w:tc>
@@ -10511,7 +10511,7 @@
               <w:rPr>
                 <w:sz w:val="18"/>
               </w:rPr>
-              <w:t>Hourglass energy critically high</w:t>
+              <w:t>해석 미완료 (출력 불완전)</w:t>
             </w:r>
           </w:p>
         </w:tc>
@@ -10569,7 +10569,7 @@
               <w:rPr>
                 <w:sz w:val="18"/>
               </w:rPr>
-              <w:t>2</w:t>
+              <w:t>3</w:t>
             </w:r>
           </w:p>
         </w:tc>
@@ -10583,7 +10583,7 @@
               <w:rPr>
                 <w:sz w:val="18"/>
               </w:rPr>
-              <w:t>4</w:t>
+              <w:t>5</w:t>
             </w:r>
           </w:p>
         </w:tc>
@@ -10625,7 +10625,7 @@
               <w:rPr>
                 <w:sz w:val="18"/>
               </w:rPr>
-              <w:t>DisplayImpactImplicit/3ptBending_1_00000001</w:t>
+              <w:t>results/MinimumModel</w:t>
             </w:r>
           </w:p>
         </w:tc>
@@ -10638,7 +10638,7 @@
               <w:rPr>
                 <w:sz w:val="18"/>
               </w:rPr>
-              <w:t>INCOMPLETE</w:t>
+              <w:t>NORMAL</w:t>
             </w:r>
           </w:p>
         </w:tc>
@@ -10651,7 +10651,7 @@
               <w:rPr>
                 <w:sz w:val="18"/>
               </w:rPr>
-              <w:t>2</w:t>
+              <w:t>3</w:t>
             </w:r>
           </w:p>
         </w:tc>
@@ -10664,7 +10664,7 @@
               <w:rPr>
                 <w:sz w:val="18"/>
               </w:rPr>
-              <w:t>3</w:t>
+              <w:t>4</w:t>
             </w:r>
           </w:p>
         </w:tc>
@@ -10677,7 +10677,7 @@
               <w:rPr>
                 <w:sz w:val="18"/>
               </w:rPr>
-              <w:t>해석 미완료 (출력 불완전)</w:t>
+              <w:t>Hourglass energy critically high</w:t>
             </w:r>
           </w:p>
         </w:tc>
@@ -10707,7 +10707,7 @@
               <w:rPr>
                 <w:sz w:val="18"/>
               </w:rPr>
-              <w:t>alt_tet_elform60/ex05_ef60_f2000_mortar</w:t>
+              <w:t>1.DisplayImpactBallPeridynamics/Impact_1_00000001</w:t>
             </w:r>
           </w:p>
         </w:tc>
@@ -10749,7 +10749,7 @@
               <w:rPr>
                 <w:sz w:val="18"/>
               </w:rPr>
-              <w:t>2</w:t>
+              <w:t>4</w:t>
             </w:r>
           </w:p>
         </w:tc>
@@ -10791,7 +10791,7 @@
               <w:rPr>
                 <w:sz w:val="18"/>
               </w:rPr>
-              <w:t>alt_tet_elform60/ex06_ef60_f5000_mortar</w:t>
+              <w:t>alt_tet_elform60/ex05_ef60_f2000_mortar</w:t>
             </w:r>
           </w:p>
         </w:tc>
@@ -10830,7 +10830,7 @@
               <w:rPr>
                 <w:sz w:val="18"/>
               </w:rPr>
-              <w:t>1</w:t>
+              <w:t>4</w:t>
             </w:r>
           </w:p>
         </w:tc>
@@ -10873,7 +10873,7 @@
               <w:rPr>
                 <w:sz w:val="18"/>
               </w:rPr>
-              <w:t>alt_tet_elform60/ex05_ef60_f2000_mortar</w:t>
+              <w:t>1.DisplayImpactBallPeridynamics/Impact_1_00000001</w:t>
             </w:r>
           </w:p>
         </w:tc>
@@ -10915,7 +10915,7 @@
               <w:rPr>
                 <w:sz w:val="18"/>
               </w:rPr>
-              <w:t>2</w:t>
+              <w:t>4</w:t>
             </w:r>
           </w:p>
         </w:tc>
@@ -10957,7 +10957,7 @@
               <w:rPr>
                 <w:sz w:val="18"/>
               </w:rPr>
-              <w:t>alt_tet_elform60/ex06_ef60_f5000_mortar</w:t>
+              <w:t>alt_tet_elform60/ex05_ef60_f2000_mortar</w:t>
             </w:r>
           </w:p>
         </w:tc>
@@ -10996,7 +10996,7 @@
               <w:rPr>
                 <w:sz w:val="18"/>
               </w:rPr>
-              <w:t>1</w:t>
+              <w:t>4</w:t>
             </w:r>
           </w:p>
         </w:tc>
@@ -11081,7 +11081,7 @@
               <w:rPr>
                 <w:sz w:val="18"/>
               </w:rPr>
-              <w:t>2</w:t>
+              <w:t>4</w:t>
             </w:r>
           </w:p>
         </w:tc>
@@ -11162,7 +11162,7 @@
               <w:rPr>
                 <w:sz w:val="18"/>
               </w:rPr>
-              <w:t>1</w:t>
+              <w:t>3</w:t>
             </w:r>
           </w:p>
         </w:tc>
@@ -11247,7 +11247,7 @@
               <w:rPr>
                 <w:sz w:val="18"/>
               </w:rPr>
-              <w:t>2</w:t>
+              <w:t>4</w:t>
             </w:r>
           </w:p>
         </w:tc>
@@ -11328,7 +11328,7 @@
               <w:rPr>
                 <w:sz w:val="18"/>
               </w:rPr>
-              <w:t>1</w:t>
+              <w:t>3</w:t>
             </w:r>
           </w:p>
         </w:tc>
@@ -11494,7 +11494,7 @@
               <w:rPr>
                 <w:sz w:val="18"/>
               </w:rPr>
-              <w:t>3</w:t>
+              <w:t>5</w:t>
             </w:r>
           </w:p>
         </w:tc>
@@ -11579,7 +11579,7 @@
               <w:rPr>
                 <w:sz w:val="18"/>
               </w:rPr>
-              <w:t>1</w:t>
+              <w:t>3</w:t>
             </w:r>
           </w:p>
         </w:tc>
@@ -11660,7 +11660,7 @@
               <w:rPr>
                 <w:sz w:val="18"/>
               </w:rPr>
-              <w:t>2</w:t>
+              <w:t>4</w:t>
             </w:r>
           </w:p>
         </w:tc>
@@ -11745,7 +11745,7 @@
               <w:rPr>
                 <w:sz w:val="18"/>
               </w:rPr>
-              <w:t>2</w:t>
+              <w:t>4</w:t>
             </w:r>
           </w:p>
         </w:tc>
@@ -11826,7 +11826,7 @@
               <w:rPr>
                 <w:sz w:val="18"/>
               </w:rPr>
-              <w:t>2</w:t>
+              <w:t>4</w:t>
             </w:r>
           </w:p>
         </w:tc>
@@ -11897,7 +11897,7 @@
               <w:rPr>
                 <w:sz w:val="18"/>
               </w:rPr>
-              <w:t>9</w:t>
+              <w:t>10</w:t>
             </w:r>
           </w:p>
         </w:tc>
@@ -11992,7 +11992,7 @@
               <w:rPr>
                 <w:sz w:val="18"/>
               </w:rPr>
-              <w:t>1</w:t>
+              <w:t>3</w:t>
             </w:r>
           </w:p>
         </w:tc>

</xml_diff>